<commit_message>
Add forward-looking paragraph on 8/20 Copilot training and 8/10 rehearsal
</commit_message>
<xml_diff>
--- a/日報_2026-08-06.docx
+++ b/日報_2026-08-06.docx
@@ -260,6 +260,17 @@
           <w:szCs w:val="21"/>
         </w:rPr>
         <w:t xml:space="preserve">本日のアクションプランの実施状況は、意思決定支援として判断論点3件を推奨案付きで整理、吸収と学習として太平さんから観点3つを教わり1つを設計に反映、能力開発としてキャッチアップの定例化に着手、です。</w:t>
+      </w:r>
+    </w:p>
+    <w:p/>
+    <w:p>
+      <w:r>
+        <w:rPr>
+          <w:rFonts w:ascii="Yu Gothic" w:cs="Yu Gothic" w:eastAsia="Yu Gothic" w:hAnsi="Yu Gothic"/>
+          <w:sz w:val="21"/>
+          <w:szCs w:val="21"/>
+        </w:rPr>
+        <w:t xml:space="preserve">また、8/20に登壇の可能性が出てきたMicrosoft 365 Copilot研修について、8/10に模擬を実施します。Copilotは自身での使用経験がないため、模擬までに操作と講義の両面で準備を進めます。ディレクションのご期待もいただいていますが、今の自分はまだ知識が足りないと痛感しているので、1日でも早くキャッチアップし、自信を持った状態で授業デビューして貢献できるよう全力で取り組みます。</w:t>
       </w:r>
     </w:p>
     <w:p/>

</xml_diff>